<commit_message>
Approve Alpha scenarios and add delivery roadmap
</commit_message>
<xml_diff>
--- a/ТЗ/Техническое задание Simple WMS Alpha.docx
+++ b/ТЗ/Техническое задание Simple WMS Alpha.docx
@@ -81,7 +81,7 @@
           <w:color w:val="14181C"/>
           <w:sz w:val="21"/>
         </w:rPr>
-        <w:t>Проект для согласования</w:t>
+        <w:t>Утверждено как основа разработки</w:t>
       </w:r>
     </w:p>
     <w:p>
@@ -104,7 +104,7 @@
           <w:color w:val="14181C"/>
           <w:sz w:val="21"/>
         </w:rPr>
-        <w:t>Alpha / направление 0.2</w:t>
+        <w:t>0.1 Alpha</w:t>
       </w:r>
     </w:p>
     <w:p>
@@ -127,7 +127,7 @@
           <w:color w:val="14181C"/>
           <w:sz w:val="21"/>
         </w:rPr>
-        <w:t>09.08.2026</w:t>
+        <w:t>10.08.2026</w:t>
       </w:r>
     </w:p>
     <w:p>
@@ -1295,7 +1295,7 @@
         <w:rPr>
           <w:rFonts w:ascii="Arial" w:hAnsi="Arial" w:eastAsia="Arial"/>
         </w:rPr>
-        <w:t>Пользователь входит по логину и паролю либо по персональному QR-пропуску в разрешённом контексте рабочего места.</w:t>
+        <w:t>Пользователь входит по логину и паролю либо по персональному машиночитаемому пропуску в формате QR или линейного штрихкода в разрешённом контексте рабочего места.</w:t>
       </w:r>
     </w:p>
     <w:p>
@@ -1389,13 +1389,13 @@
           <w:b/>
           <w:color w:val="0F2C46"/>
         </w:rPr>
-        <w:t xml:space="preserve">AUTH-02 QR-пропуск. </w:t>
-      </w:r>
-      <w:r>
-        <w:rPr>
-          <w:rFonts w:ascii="Arial" w:hAnsi="Arial" w:eastAsia="Arial"/>
-        </w:rPr>
-        <w:t>Персональный QR содержит случайный непрогнозируемый токен, а не логин, пароль или открытый идентификатор с правом входа.</w:t>
+        <w:t xml:space="preserve">AUTH-02 Персональный пропуск. </w:t>
+      </w:r>
+      <w:r>
+        <w:rPr>
+          <w:rFonts w:ascii="Arial" w:hAnsi="Arial" w:eastAsia="Arial"/>
+        </w:rPr>
+        <w:t>QR или линейный штрихкод содержит один случайный непрогнозируемый токен, а не логин, пароль или открытый идентификатор с правом входа. Формат представления выбирается по оборудованию рабочего места.</w:t>
       </w:r>
     </w:p>
     <w:p>
@@ -1409,13 +1409,13 @@
           <w:b/>
           <w:color w:val="0F2C46"/>
         </w:rPr>
-        <w:t xml:space="preserve">AUTH-03 Хранение QR. </w:t>
-      </w:r>
-      <w:r>
-        <w:rPr>
-          <w:rFonts w:ascii="Arial" w:hAnsi="Arial" w:eastAsia="Arial"/>
-        </w:rPr>
-        <w:t>На сервере хранится хеш токена, владелец, срок действия при наличии, состояние, дата выдачи и отзыва.</w:t>
+        <w:t xml:space="preserve">AUTH-03 Хранение пропуска. </w:t>
+      </w:r>
+      <w:r>
+        <w:rPr>
+          <w:rFonts w:ascii="Arial" w:hAnsi="Arial" w:eastAsia="Arial"/>
+        </w:rPr>
+        <w:t>На сервере хранится только хеш токена, владелец, срок действия при наличии, состояние, дата выдачи и отзыва.</w:t>
       </w:r>
     </w:p>
     <w:p>
@@ -1435,7 +1435,7 @@
         <w:rPr>
           <w:rFonts w:ascii="Arial" w:hAnsi="Arial" w:eastAsia="Arial"/>
         </w:rPr>
-        <w:t>QR-вход разрешается только на зарегистрированных рабочих местах или в явно разрешённом организацией режиме и создаёт обычную краткоживущую сессию.</w:t>
+        <w:t>Вход по пропуску разрешается только на зарегистрированных рабочих местах или в явно разрешённом организацией режиме и создаёт обычную краткоживущую сессию.</w:t>
       </w:r>
     </w:p>
     <w:p>
@@ -1455,7 +1455,7 @@
         <w:rPr>
           <w:rFonts w:ascii="Arial" w:hAnsi="Arial" w:eastAsia="Arial"/>
         </w:rPr>
-        <w:t>QR-вход не меняет роль и область складов пользователя и не предоставляет дополнительных полномочий.</w:t>
+        <w:t>Вход по пропуску не меняет роль и область складов пользователя и не предоставляет дополнительных полномочий.</w:t>
       </w:r>
     </w:p>
     <w:p>
@@ -1495,7 +1495,7 @@
         <w:rPr>
           <w:rFonts w:ascii="Arial" w:hAnsi="Arial" w:eastAsia="Arial"/>
         </w:rPr>
-        <w:t>QR-пропуск немедленно отзывается администратором; после увольнения, потери или блокировки пользователя новые сессии не создаются.</w:t>
+        <w:t>Пропуск немедленно отзывается полномочным пользователем; после увольнения, потери или блокировки пользователя новые сессии не создаются, а связанные активные сессии могут быть принудительно завершены.</w:t>
       </w:r>
     </w:p>
     <w:p>
@@ -1516,6 +1516,86 @@
           <w:rFonts w:ascii="Arial" w:hAnsi="Arial" w:eastAsia="Arial"/>
         </w:rPr>
         <w:t>Поддерживаются ручной выход, автоматическая блокировка по бездействию и быстрая смена оператора без сохранения действий за предыдущим пользователем.</w:t>
+      </w:r>
+    </w:p>
+    <w:p>
+      <w:pPr>
+        <w:keepLines/>
+        <w:spacing w:after="100"/>
+      </w:pPr>
+      <w:r>
+        <w:rPr>
+          <w:rFonts w:ascii="Arial" w:hAnsi="Arial" w:eastAsia="Arial"/>
+          <w:b/>
+          <w:color w:val="0F2C46"/>
+        </w:rPr>
+        <w:t xml:space="preserve">AUTH-09 Выпуск. </w:t>
+      </w:r>
+      <w:r>
+        <w:rPr>
+          <w:rFonts w:ascii="Arial" w:hAnsi="Arial" w:eastAsia="Arial"/>
+        </w:rPr>
+        <w:t>Пропуск выпускает администратор, старший кладовщик в пределах назначенных складов либо сам пользователь из своего профиля после повторного подтверждения логина и пароля.</w:t>
+      </w:r>
+    </w:p>
+    <w:p>
+      <w:pPr>
+        <w:keepLines/>
+        <w:spacing w:after="100"/>
+      </w:pPr>
+      <w:r>
+        <w:rPr>
+          <w:rFonts w:ascii="Arial" w:hAnsi="Arial" w:eastAsia="Arial"/>
+          <w:b/>
+          <w:color w:val="0F2C46"/>
+        </w:rPr>
+        <w:t xml:space="preserve">AUTH-10 Одноразовая выдача. </w:t>
+      </w:r>
+      <w:r>
+        <w:rPr>
+          <w:rFonts w:ascii="Arial" w:hAnsi="Arial" w:eastAsia="Arial"/>
+        </w:rPr>
+        <w:t>Открытый токен показывается, скачивается или отправляется на печать только в момент выпуска. Получить существующий токен повторно невозможно, поскольку сервер хранит только его хеш.</w:t>
+      </w:r>
+    </w:p>
+    <w:p>
+      <w:pPr>
+        <w:keepLines/>
+        <w:spacing w:after="100"/>
+      </w:pPr>
+      <w:r>
+        <w:rPr>
+          <w:rFonts w:ascii="Arial" w:hAnsi="Arial" w:eastAsia="Arial"/>
+          <w:b/>
+          <w:color w:val="0F2C46"/>
+        </w:rPr>
+        <w:t xml:space="preserve">AUTH-11 Перевыпуск. </w:t>
+      </w:r>
+      <w:r>
+        <w:rPr>
+          <w:rFonts w:ascii="Arial" w:hAnsi="Arial" w:eastAsia="Arial"/>
+        </w:rPr>
+        <w:t>Каждая новая выдача создаёт новый токен и в одной транзакции отзывает прежний активный пропуск пользователя. Старый QR или штрихкод перестаёт создавать сессии немедленно.</w:t>
+      </w:r>
+    </w:p>
+    <w:p>
+      <w:pPr>
+        <w:keepLines/>
+        <w:spacing w:after="100"/>
+      </w:pPr>
+      <w:r>
+        <w:rPr>
+          <w:rFonts w:ascii="Arial" w:hAnsi="Arial" w:eastAsia="Arial"/>
+          <w:b/>
+          <w:color w:val="0F2C46"/>
+        </w:rPr>
+        <w:t xml:space="preserve">AUTH-12 Аудит выдачи. </w:t>
+      </w:r>
+      <w:r>
+        <w:rPr>
+          <w:rFonts w:ascii="Arial" w:hAnsi="Arial" w:eastAsia="Arial"/>
+        </w:rPr>
+        <w:t>Журнал содержит владельца, инициатора, способ выпуска, время, рабочее место, причину перевыпуска и результат. Действия по пропуску всегда относятся к его владельцу; интерфейс сообщает о персональном характере пропуска.</w:t>
       </w:r>
     </w:p>
     <w:p>
@@ -4821,13 +4901,13 @@
           <w:b/>
           <w:color w:val="0F2C46"/>
         </w:rPr>
-        <w:t xml:space="preserve">SCAN-05 QR пользователя. </w:t>
-      </w:r>
-      <w:r>
-        <w:rPr>
-          <w:rFonts w:ascii="Arial" w:hAnsi="Arial" w:eastAsia="Arial"/>
-        </w:rPr>
-        <w:t>Персональный QR распознаётся как учётный пропуск только на экране входа или смены оператора и не выполняет складскую операцию сам по себе.</w:t>
+        <w:t xml:space="preserve">SCAN-05 Код пользователя. </w:t>
+      </w:r>
+      <w:r>
+        <w:rPr>
+          <w:rFonts w:ascii="Arial" w:hAnsi="Arial" w:eastAsia="Arial"/>
+        </w:rPr>
+        <w:t>Персональный QR или штрихкод распознаётся как учётный пропуск только на экране входа или смены оператора и не выполняет складскую операцию сам по себе.</w:t>
       </w:r>
     </w:p>
     <w:p>
@@ -7213,13 +7293,13 @@
           <w:b/>
           <w:color w:val="0F2C46"/>
         </w:rPr>
-        <w:t xml:space="preserve">SEC-01 Пароли, QR и сессии. </w:t>
-      </w:r>
-      <w:r>
-        <w:rPr>
-          <w:rFonts w:ascii="Arial" w:hAnsi="Arial" w:eastAsia="Arial"/>
-        </w:rPr>
-        <w:t>Пароли и QR-токены хешируются современным алгоритмом; сессии ограничены сроком, привязаны к пользователю и могут быть отозваны.</w:t>
+        <w:t xml:space="preserve">SEC-01 Пароли, пропуска и сессии. </w:t>
+      </w:r>
+      <w:r>
+        <w:rPr>
+          <w:rFonts w:ascii="Arial" w:hAnsi="Arial" w:eastAsia="Arial"/>
+        </w:rPr>
+        <w:t>Пароли и токены машиночитаемых пропусков хешируются современным алгоритмом; сессии ограничены сроком, привязаны к пользователю и могут быть отозваны.</w:t>
       </w:r>
     </w:p>
     <w:p>
@@ -8561,7 +8641,7 @@
                 <w:rFonts w:ascii="Arial" w:hAnsi="Arial" w:eastAsia="Arial"/>
                 <w:sz w:val="19"/>
               </w:rPr>
-              <w:t>Вход по QR</w:t>
+              <w:t>Вход по пропуску</w:t>
             </w:r>
           </w:p>
         </w:tc>
@@ -8585,7 +8665,57 @@
                 <w:rFonts w:ascii="Arial" w:hAnsi="Arial" w:eastAsia="Arial"/>
                 <w:sz w:val="19"/>
               </w:rPr>
-              <w:t>Персональный QR создаёт сессию на разрешённом рабочем месте; отозванный QR и заблокированный пользователь вход не выполняют</w:t>
+              <w:t>Персональный QR или штрихкод создаёт сессию на разрешённом рабочем месте; отозванный код и заблокированный пользователь вход не выполняют</w:t>
+            </w:r>
+          </w:p>
+        </w:tc>
+      </w:tr>
+      <w:tr>
+        <w:tc>
+          <w:tcPr>
+            <w:tcW w:type="dxa" w:w="2600"/>
+            <w:vAlign w:val="center"/>
+            <w:tcMar>
+              <w:top w:w="80" w:type="dxa"/>
+              <w:start w:w="120" w:type="dxa"/>
+              <w:bottom w:w="80" w:type="dxa"/>
+              <w:end w:w="120" w:type="dxa"/>
+            </w:tcMar>
+          </w:tcPr>
+          <w:p>
+            <w:pPr>
+              <w:pStyle w:val="TableText"/>
+            </w:pPr>
+            <w:r>
+              <w:rPr>
+                <w:rFonts w:ascii="Arial" w:hAnsi="Arial" w:eastAsia="Arial"/>
+                <w:sz w:val="19"/>
+              </w:rPr>
+              <w:t>Перевыпуск пропуска</w:t>
+            </w:r>
+          </w:p>
+        </w:tc>
+        <w:tc>
+          <w:tcPr>
+            <w:tcW w:type="dxa" w:w="6640"/>
+            <w:vAlign w:val="center"/>
+            <w:tcMar>
+              <w:top w:w="80" w:type="dxa"/>
+              <w:start w:w="120" w:type="dxa"/>
+              <w:bottom w:w="80" w:type="dxa"/>
+              <w:end w:w="120" w:type="dxa"/>
+            </w:tcMar>
+          </w:tcPr>
+          <w:p>
+            <w:pPr>
+              <w:pStyle w:val="TableText"/>
+            </w:pPr>
+            <w:r>
+              <w:rPr>
+                <w:rFonts w:ascii="Arial" w:hAnsi="Arial" w:eastAsia="Arial"/>
+                <w:sz w:val="19"/>
+              </w:rPr>
+              <w:t>Новый выпуск доступен старшему, администратору или владельцу после входа паролем; прежний код немедленно отзывается и не может быть показан повторно</w:t>
             </w:r>
           </w:p>
         </w:tc>

</xml_diff>